<commit_message>
Hide small-sample search indices and explain low-baseline limits
</commit_message>
<xml_diff>
--- a/user_summary_review/26.9汇总表_完善说明与分析结论.docx
+++ b/user_summary_review/26.9汇总表_完善说明与分析结论.docx
@@ -2476,6 +2476,16 @@
     </w:p>
     <w:p>
       <w:r>
+        <w:t>两个指数仅作同词相对比率的辅助描述，不作为机会排名。样本点击少于100时，总表和看板均留空；100点击是工作筛选线，不是统计显著性或稳定性保证。市场基准很低时，即使达到筛选线，倍数仍可能很大，须一起看原始计数、绝对比率及百分点差。购买承接还须核查购买计数；不能把零购买自动判为无承接能力。</w:t>
+      </w:r>
+    </w:p>
+    <w:p>
+      <w:r>
+        <w:t>例如hal只有1次样本曝光、1次点击，CTR为100%；市场为1,648次点击/10,764,360次曝光，CTR约0.01531%，原始比值约6,532倍。这不能证明吸引力强。再出现1次曝光而没有点击，样本CTR就会降到50%。当前保留原始计数与CTR，隐藏小样本倍数，不修改原始数据或截断极端值。</w:t>
+      </w:r>
+    </w:p>
+    <w:p>
+      <w:r>
         <w:t>每条结论按“事实→可能原因→验证动作”写。例如：cold brew pitcher有1,181点击69购买，同词购买率低于市场；可能与功能意图、价格、页面或流量位置有关；先检查各ASIN、实际投放商品和页面资料，再做小范围单变量测试。</w:t>
       </w:r>
     </w:p>

</xml_diff>